<commit_message>
docs: segarkan Internal & Investor (exports/) dgn fitur Q2 2026 (referral, voice, offline, checklist wajib-foto, absensi hardening); pensiunkan draft tipis
</commit_message>
<xml_diff>
--- a/docs/exports/LAMASY-Internal-Document.docx
+++ b/docs/exports/LAMASY-Internal-Document.docx
@@ -277,7 +277,7 @@
           <w:b/>
           <w:bCs/>
         </w:rPr>
-        <w:t xml:space="preserve">103 tabel database </w:t>
+        <w:t xml:space="preserve">~125 tabel database </w:t>
       </w:r>
       <w:r>
         <w:t xml:space="preserve">mencakup operasional, finansial, HR, AI, dan platform</w:t>
@@ -13404,7 +13404,7 @@
                 <w:sz w:val="20"/>
                 <w:szCs w:val="20"/>
               </w:rPr>
-              <w:t xml:space="preserve">103</w:t>
+              <w:t xml:space="preserve">~125</w:t>
             </w:r>
           </w:p>
         </w:tc>
@@ -13858,6 +13858,917 @@
         </w:tc>
       </w:tr>
     </w:tbl>
+    <w:p>
+      <w:r>
+        <w:br w:type="page"/>
+      </w:r>
+    </w:p>
+    <w:p>
+      <w:pPr>
+        <w:pStyle w:val="Heading1"/>
+        <w:spacing w:after="200" w:before="480"/>
+      </w:pPr>
+      <w:r>
+        <w:t xml:space="preserve">15. Update Fitur — Q2 2026</w:t>
+      </w:r>
+    </w:p>
+    <w:p>
+      <w:r>
+        <w:t xml:space="preserve">Modul &amp; penyempurnaan yang live setelah 24 Juni 2026. Semua opt-in / aman dan terintegrasi ke modul terkait. Detail spec &amp; plan ada di docs/superpowers/.</w:t>
+      </w:r>
+    </w:p>
+    <w:p>
+      <w:pPr>
+        <w:pStyle w:val="Heading2"/>
+        <w:spacing w:after="120" w:before="320"/>
+      </w:pPr>
+      <w:r>
+        <w:t xml:space="preserve">15.1 Referral / Ajak Teman</w:t>
+      </w:r>
+    </w:p>
+    <w:p>
+      <w:pPr>
+        <w:pStyle w:val="ListParagraph"/>
+        <w:numPr>
+          <w:ilvl w:val="0"/>
+          <w:numId w:val="2"/>
+        </w:numPr>
+      </w:pPr>
+      <w:r>
+        <w:t xml:space="preserve">Opt-in per owner (tenants.referral_enabled + butuh loyalty aktif). Diatur di HQ → Loyalty.</w:t>
+      </w:r>
+    </w:p>
+    <w:p>
+      <w:pPr>
+        <w:pStyle w:val="ListParagraph"/>
+        <w:numPr>
+          <w:ilvl w:val="0"/>
+          <w:numId w:val="2"/>
+        </w:numPr>
+      </w:pPr>
+      <w:r>
+        <w:t xml:space="preserve">Pelanggan punya kode referral (hl_pelanggan.referral_code) + link share ?ref= ke self-booking.</w:t>
+      </w:r>
+    </w:p>
+    <w:p>
+      <w:pPr>
+        <w:pStyle w:val="ListParagraph"/>
+        <w:numPr>
+          <w:ilvl w:val="0"/>
+          <w:numId w:val="2"/>
+        </w:numPr>
+      </w:pPr>
+      <w:r>
+        <w:t xml:space="preserve">Atribusi 2 jalur: input kode manual di POS/self-booking ATAU link share. Tabel hl_referral (UNIQUE referee = satu teman sekali).</w:t>
+      </w:r>
+    </w:p>
+    <w:p>
+      <w:pPr>
+        <w:pStyle w:val="ListParagraph"/>
+        <w:numPr>
+          <w:ilvl w:val="0"/>
+          <w:numId w:val="2"/>
+        </w:numPr>
+      </w:pPr>
+      <w:r>
+        <w:t xml:space="preserve">Payout: pengajak + teman dapat poin saat order pertama teman LUNAS (idempoten, via Loyalty::adjust). Cap per-pengajak; cap penuh → teman tetap dapat, pengajak 0.</w:t>
+      </w:r>
+    </w:p>
+    <w:p>
+      <w:pPr>
+        <w:pStyle w:val="ListParagraph"/>
+        <w:numPr>
+          <w:ilvl w:val="0"/>
+          <w:numId w:val="2"/>
+        </w:numPr>
+      </w:pPr>
+      <w:r>
+        <w:t xml:space="preserve">Anti-abuse: teman harus baru (tak punya order), no self-refer (id+telepon). core/Referral.php.</w:t>
+      </w:r>
+    </w:p>
+    <w:p>
+      <w:pPr>
+        <w:pStyle w:val="Heading2"/>
+        <w:spacing w:after="120" w:before="320"/>
+      </w:pPr>
+      <w:r>
+        <w:t xml:space="preserve">15.2 Voice Order (POS)</w:t>
+      </w:r>
+    </w:p>
+    <w:p>
+      <w:pPr>
+        <w:pStyle w:val="ListParagraph"/>
+        <w:numPr>
+          <w:ilvl w:val="0"/>
+          <w:numId w:val="2"/>
+        </w:numPr>
+      </w:pPr>
+      <w:r>
+        <w:t xml:space="preserve">Kasir input order via suara: rekam → STT (native Android) → api/voice_order_parse.php → core/VoiceOrderParser.php (Claude) → form POS terisi.</w:t>
+      </w:r>
+    </w:p>
+    <w:p>
+      <w:pPr>
+        <w:pStyle w:val="ListParagraph"/>
+        <w:numPr>
+          <w:ilvl w:val="0"/>
+          <w:numId w:val="2"/>
+        </w:numPr>
+      </w:pPr>
+      <w:r>
+        <w:t xml:space="preserve">Tombol mic berubah state saat recording; potong coin hanya saat parse sukses. Termasuk dalam metering AI.</w:t>
+      </w:r>
+    </w:p>
+    <w:p>
+      <w:pPr>
+        <w:pStyle w:val="Heading2"/>
+        <w:spacing w:after="120" w:before="320"/>
+      </w:pPr>
+      <w:r>
+        <w:t xml:space="preserve">15.3 Offline POS + Sync</w:t>
+      </w:r>
+    </w:p>
+    <w:p>
+      <w:pPr>
+        <w:pStyle w:val="ListParagraph"/>
+        <w:numPr>
+          <w:ilvl w:val="0"/>
+          <w:numId w:val="2"/>
+        </w:numPr>
+      </w:pPr>
+      <w:r>
+        <w:t xml:space="preserve">POS tetap menerima order saat internet mati. assets/offline-pos.js: IndexedDB (katalog cache + antrian order).</w:t>
+      </w:r>
+    </w:p>
+    <w:p>
+      <w:pPr>
+        <w:pStyle w:val="ListParagraph"/>
+        <w:numPr>
+          <w:ilvl w:val="0"/>
+          <w:numId w:val="2"/>
+        </w:numPr>
+      </w:pPr>
+      <w:r>
+        <w:t xml:space="preserve">Endpoint pos.php?action=catalog_snapshot &amp; sync_offline; core/OrderCreator.php::createOffline. Idempoten via hl_transaksi.offline_uuid (UNIQUE).</w:t>
+      </w:r>
+    </w:p>
+    <w:p>
+      <w:pPr>
+        <w:pStyle w:val="ListParagraph"/>
+        <w:numPr>
+          <w:ilvl w:val="0"/>
+          <w:numId w:val="2"/>
+        </w:numPr>
+      </w:pPr>
+      <w:r>
+        <w:t xml:space="preserve">Struk offline pakai kode sementara OFF-&lt;dev&gt;-&lt;seq&gt;; saat sync dapat nomor asli + alias offline_ref (tetap bisa dilacak di track.php/orders.php).</w:t>
+      </w:r>
+    </w:p>
+    <w:p>
+      <w:pPr>
+        <w:pStyle w:val="ListParagraph"/>
+        <w:numPr>
+          <w:ilvl w:val="0"/>
+          <w:numId w:val="2"/>
+        </w:numPr>
+      </w:pPr>
+      <w:r>
+        <w:t xml:space="preserve">Service worker sw-tenant.js cache shell POS. Kontrol online-only (deposit/redeem/voucher) auto-disable saat offline; network-fail saat online → fallback enqueue.</w:t>
+      </w:r>
+    </w:p>
+    <w:p>
+      <w:pPr>
+        <w:pStyle w:val="Heading2"/>
+        <w:spacing w:after="120" w:before="320"/>
+      </w:pPr>
+      <w:r>
+        <w:t xml:space="preserve">15.4 Checklist Wajib-Foto</w:t>
+      </w:r>
+    </w:p>
+    <w:p>
+      <w:pPr>
+        <w:pStyle w:val="ListParagraph"/>
+        <w:numPr>
+          <w:ilvl w:val="0"/>
+          <w:numId w:val="2"/>
+        </w:numPr>
+      </w:pPr>
+      <w:r>
+        <w:t xml:space="preserve">Saat buat template checklist, tiap item bisa ditandai 'wajib foto'. core/Checklist.php; data di items_json/answers_json (tanpa migrasi).</w:t>
+      </w:r>
+    </w:p>
+    <w:p>
+      <w:pPr>
+        <w:pStyle w:val="ListParagraph"/>
+        <w:numPr>
+          <w:ilvl w:val="0"/>
+          <w:numId w:val="2"/>
+        </w:numPr>
+      </w:pPr>
+      <w:r>
+        <w:t xml:space="preserve">Sisi pengisian: item wajib-foto yang dicentang harus lampirkan foto — blok simpan (validasi klien + server otoritatif). Upload ke uploads/foto_checklist (anti-XSS path).</w:t>
+      </w:r>
+    </w:p>
+    <w:p>
+      <w:pPr>
+        <w:pStyle w:val="Heading2"/>
+        <w:spacing w:after="120" w:before="320"/>
+      </w:pPr>
+      <w:r>
+        <w:t xml:space="preserve">15.5 Absensi: Selfie + Geofence + Shift</w:t>
+      </w:r>
+    </w:p>
+    <w:p>
+      <w:pPr>
+        <w:pStyle w:val="ListParagraph"/>
+        <w:numPr>
+          <w:ilvl w:val="0"/>
+          <w:numId w:val="2"/>
+        </w:numPr>
+      </w:pPr>
+      <w:r>
+        <w:t xml:space="preserve">Clock-in: selfie WAJIB + geofence ketat (config per-outlet + peta Leaflet). Lokasi diverifikasi server.</w:t>
+      </w:r>
+    </w:p>
+    <w:p>
+      <w:pPr>
+        <w:pStyle w:val="ListParagraph"/>
+        <w:numPr>
+          <w:ilvl w:val="0"/>
+          <w:numId w:val="2"/>
+        </w:numPr>
+      </w:pPr>
+      <w:r>
+        <w:t xml:space="preserve">Jadwal shift (hl_shift / hl_jadwal_shift): hitung telat/lembur otomatis (core/ShiftCalc.php), snapshot saat absen, handover shift.</w:t>
+      </w:r>
+    </w:p>
+    <w:p>
+      <w:pPr>
+        <w:pStyle w:val="Heading2"/>
+        <w:spacing w:after="120" w:before="320"/>
+      </w:pPr>
+      <w:r>
+        <w:t xml:space="preserve">15.6 Penggajian: Bonus &amp; Bagi-Hasil</w:t>
+      </w:r>
+    </w:p>
+    <w:p>
+      <w:pPr>
+        <w:pStyle w:val="ListParagraph"/>
+        <w:numPr>
+          <w:ilvl w:val="0"/>
+          <w:numId w:val="2"/>
+        </w:numPr>
+      </w:pPr>
+      <w:r>
+        <w:t xml:space="preserve">Aturan bonus karyawan (hl_bonus_rule, core/BonusEvaluator.php) masuk ke slip gaji.</w:t>
+      </w:r>
+    </w:p>
+    <w:p>
+      <w:pPr>
+        <w:pStyle w:val="ListParagraph"/>
+        <w:numPr>
+          <w:ilvl w:val="0"/>
+          <w:numId w:val="2"/>
+        </w:numPr>
+      </w:pPr>
+      <w:r>
+        <w:t xml:space="preserve">Bagi-hasil (core/BagiHasilCalculator.php, hl_bagi_hasil) untuk skema profit-sharing.</w:t>
+      </w:r>
+    </w:p>
+    <w:p>
+      <w:pPr>
+        <w:pStyle w:val="Heading2"/>
+        <w:spacing w:after="120" w:before="320"/>
+      </w:pPr>
+      <w:r>
+        <w:t xml:space="preserve">15.7 Ringkasan Fitur Baru</w:t>
+      </w:r>
+    </w:p>
+    <w:tbl>
+      <w:tblPr>
+        <w:tblW w:type="dxa" w:w="9360"/>
+        <w:tblBorders>
+          <w:top w:val="single" w:color="auto" w:sz="4"/>
+          <w:left w:val="single" w:color="auto" w:sz="4"/>
+          <w:bottom w:val="single" w:color="auto" w:sz="4"/>
+          <w:right w:val="single" w:color="auto" w:sz="4"/>
+          <w:insideH w:val="single" w:color="auto" w:sz="4"/>
+          <w:insideV w:val="single" w:color="auto" w:sz="4"/>
+        </w:tblBorders>
+      </w:tblPr>
+      <w:tblGrid>
+        <w:gridCol w:w="3120"/>
+        <w:gridCol w:w="3120"/>
+        <w:gridCol w:w="3120"/>
+      </w:tblGrid>
+      <w:tr>
+        <w:tc>
+          <w:tcPr>
+            <w:tcW w:type="dxa" w:w="3120"/>
+            <w:tcBorders>
+              <w:top w:val="single" w:color="E5E7EB" w:sz="4"/>
+              <w:left w:val="single" w:color="E5E7EB" w:sz="4"/>
+              <w:bottom w:val="single" w:color="E5E7EB" w:sz="4"/>
+              <w:right w:val="single" w:color="E5E7EB" w:sz="4"/>
+            </w:tcBorders>
+            <w:shd w:fill="0F1C3A" w:val="clear"/>
+            <w:tcMar>
+              <w:top w:type="dxa" w:w="80"/>
+              <w:left w:type="dxa" w:w="120"/>
+              <w:bottom w:type="dxa" w:w="80"/>
+              <w:right w:type="dxa" w:w="120"/>
+            </w:tcMar>
+          </w:tcPr>
+          <w:p>
+            <w:r>
+              <w:rPr>
+                <w:b/>
+                <w:bCs/>
+                <w:color w:val="FFFFFF"/>
+                <w:sz w:val="20"/>
+                <w:szCs w:val="20"/>
+              </w:rPr>
+              <w:t xml:space="preserve">Fitur</w:t>
+            </w:r>
+          </w:p>
+        </w:tc>
+        <w:tc>
+          <w:tcPr>
+            <w:tcW w:type="dxa" w:w="3120"/>
+            <w:tcBorders>
+              <w:top w:val="single" w:color="E5E7EB" w:sz="4"/>
+              <w:left w:val="single" w:color="E5E7EB" w:sz="4"/>
+              <w:bottom w:val="single" w:color="E5E7EB" w:sz="4"/>
+              <w:right w:val="single" w:color="E5E7EB" w:sz="4"/>
+            </w:tcBorders>
+            <w:shd w:fill="0F1C3A" w:val="clear"/>
+            <w:tcMar>
+              <w:top w:type="dxa" w:w="80"/>
+              <w:left w:type="dxa" w:w="120"/>
+              <w:bottom w:type="dxa" w:w="80"/>
+              <w:right w:type="dxa" w:w="120"/>
+            </w:tcMar>
+          </w:tcPr>
+          <w:p>
+            <w:r>
+              <w:rPr>
+                <w:b/>
+                <w:bCs/>
+                <w:color w:val="FFFFFF"/>
+                <w:sz w:val="20"/>
+                <w:szCs w:val="20"/>
+              </w:rPr>
+              <w:t xml:space="preserve">Inti</w:t>
+            </w:r>
+          </w:p>
+        </w:tc>
+        <w:tc>
+          <w:tcPr>
+            <w:tcW w:type="dxa" w:w="3120"/>
+            <w:tcBorders>
+              <w:top w:val="single" w:color="E5E7EB" w:sz="4"/>
+              <w:left w:val="single" w:color="E5E7EB" w:sz="4"/>
+              <w:bottom w:val="single" w:color="E5E7EB" w:sz="4"/>
+              <w:right w:val="single" w:color="E5E7EB" w:sz="4"/>
+            </w:tcBorders>
+            <w:shd w:fill="0F1C3A" w:val="clear"/>
+            <w:tcMar>
+              <w:top w:type="dxa" w:w="80"/>
+              <w:left w:type="dxa" w:w="120"/>
+              <w:bottom w:type="dxa" w:w="80"/>
+              <w:right w:type="dxa" w:w="120"/>
+            </w:tcMar>
+          </w:tcPr>
+          <w:p>
+            <w:r>
+              <w:rPr>
+                <w:b/>
+                <w:bCs/>
+                <w:color w:val="FFFFFF"/>
+                <w:sz w:val="20"/>
+                <w:szCs w:val="20"/>
+              </w:rPr>
+              <w:t xml:space="preserve">Status</w:t>
+            </w:r>
+          </w:p>
+        </w:tc>
+      </w:tr>
+      <w:tr>
+        <w:tc>
+          <w:tcPr>
+            <w:tcW w:type="dxa" w:w="3120"/>
+            <w:tcBorders>
+              <w:top w:val="single" w:color="E5E7EB" w:sz="4"/>
+              <w:left w:val="single" w:color="E5E7EB" w:sz="4"/>
+              <w:bottom w:val="single" w:color="E5E7EB" w:sz="4"/>
+              <w:right w:val="single" w:color="E5E7EB" w:sz="4"/>
+            </w:tcBorders>
+            <w:tcMar>
+              <w:top w:type="dxa" w:w="80"/>
+              <w:left w:type="dxa" w:w="120"/>
+              <w:bottom w:type="dxa" w:w="80"/>
+              <w:right w:type="dxa" w:w="120"/>
+            </w:tcMar>
+          </w:tcPr>
+          <w:p>
+            <w:r>
+              <w:rPr>
+                <w:color w:val="1A1F2E"/>
+                <w:sz w:val="20"/>
+                <w:szCs w:val="20"/>
+              </w:rPr>
+              <w:t xml:space="preserve">Referral</w:t>
+            </w:r>
+          </w:p>
+        </w:tc>
+        <w:tc>
+          <w:tcPr>
+            <w:tcW w:type="dxa" w:w="3120"/>
+            <w:tcBorders>
+              <w:top w:val="single" w:color="E5E7EB" w:sz="4"/>
+              <w:left w:val="single" w:color="E5E7EB" w:sz="4"/>
+              <w:bottom w:val="single" w:color="E5E7EB" w:sz="4"/>
+              <w:right w:val="single" w:color="E5E7EB" w:sz="4"/>
+            </w:tcBorders>
+            <w:tcMar>
+              <w:top w:type="dxa" w:w="80"/>
+              <w:left w:type="dxa" w:w="120"/>
+              <w:bottom w:type="dxa" w:w="80"/>
+              <w:right w:type="dxa" w:w="120"/>
+            </w:tcMar>
+          </w:tcPr>
+          <w:p>
+            <w:r>
+              <w:rPr>
+                <w:color w:val="1A1F2E"/>
+                <w:sz w:val="20"/>
+                <w:szCs w:val="20"/>
+              </w:rPr>
+              <w:t xml:space="preserve">Kode/link → poin dua-duanya saat order pertama teman lunas (opt-in)</w:t>
+            </w:r>
+          </w:p>
+        </w:tc>
+        <w:tc>
+          <w:tcPr>
+            <w:tcW w:type="dxa" w:w="3120"/>
+            <w:tcBorders>
+              <w:top w:val="single" w:color="E5E7EB" w:sz="4"/>
+              <w:left w:val="single" w:color="E5E7EB" w:sz="4"/>
+              <w:bottom w:val="single" w:color="E5E7EB" w:sz="4"/>
+              <w:right w:val="single" w:color="E5E7EB" w:sz="4"/>
+            </w:tcBorders>
+            <w:tcMar>
+              <w:top w:type="dxa" w:w="80"/>
+              <w:left w:type="dxa" w:w="120"/>
+              <w:bottom w:type="dxa" w:w="80"/>
+              <w:right w:type="dxa" w:w="120"/>
+            </w:tcMar>
+          </w:tcPr>
+          <w:p>
+            <w:r>
+              <w:rPr>
+                <w:color w:val="1A1F2E"/>
+                <w:sz w:val="20"/>
+                <w:szCs w:val="20"/>
+              </w:rPr>
+              <w:t xml:space="preserve">Live</w:t>
+            </w:r>
+          </w:p>
+        </w:tc>
+      </w:tr>
+      <w:tr>
+        <w:tc>
+          <w:tcPr>
+            <w:tcW w:type="dxa" w:w="3120"/>
+            <w:tcBorders>
+              <w:top w:val="single" w:color="E5E7EB" w:sz="4"/>
+              <w:left w:val="single" w:color="E5E7EB" w:sz="4"/>
+              <w:bottom w:val="single" w:color="E5E7EB" w:sz="4"/>
+              <w:right w:val="single" w:color="E5E7EB" w:sz="4"/>
+            </w:tcBorders>
+            <w:tcMar>
+              <w:top w:type="dxa" w:w="80"/>
+              <w:left w:type="dxa" w:w="120"/>
+              <w:bottom w:type="dxa" w:w="80"/>
+              <w:right w:type="dxa" w:w="120"/>
+            </w:tcMar>
+          </w:tcPr>
+          <w:p>
+            <w:r>
+              <w:rPr>
+                <w:color w:val="1A1F2E"/>
+                <w:sz w:val="20"/>
+                <w:szCs w:val="20"/>
+              </w:rPr>
+              <w:t xml:space="preserve">Voice Order</w:t>
+            </w:r>
+          </w:p>
+        </w:tc>
+        <w:tc>
+          <w:tcPr>
+            <w:tcW w:type="dxa" w:w="3120"/>
+            <w:tcBorders>
+              <w:top w:val="single" w:color="E5E7EB" w:sz="4"/>
+              <w:left w:val="single" w:color="E5E7EB" w:sz="4"/>
+              <w:bottom w:val="single" w:color="E5E7EB" w:sz="4"/>
+              <w:right w:val="single" w:color="E5E7EB" w:sz="4"/>
+            </w:tcBorders>
+            <w:tcMar>
+              <w:top w:type="dxa" w:w="80"/>
+              <w:left w:type="dxa" w:w="120"/>
+              <w:bottom w:type="dxa" w:w="80"/>
+              <w:right w:type="dxa" w:w="120"/>
+            </w:tcMar>
+          </w:tcPr>
+          <w:p>
+            <w:r>
+              <w:rPr>
+                <w:color w:val="1A1F2E"/>
+                <w:sz w:val="20"/>
+                <w:szCs w:val="20"/>
+              </w:rPr>
+              <w:t xml:space="preserve">Suara → AI parse → form POS (metered coin)</w:t>
+            </w:r>
+          </w:p>
+        </w:tc>
+        <w:tc>
+          <w:tcPr>
+            <w:tcW w:type="dxa" w:w="3120"/>
+            <w:tcBorders>
+              <w:top w:val="single" w:color="E5E7EB" w:sz="4"/>
+              <w:left w:val="single" w:color="E5E7EB" w:sz="4"/>
+              <w:bottom w:val="single" w:color="E5E7EB" w:sz="4"/>
+              <w:right w:val="single" w:color="E5E7EB" w:sz="4"/>
+            </w:tcBorders>
+            <w:tcMar>
+              <w:top w:type="dxa" w:w="80"/>
+              <w:left w:type="dxa" w:w="120"/>
+              <w:bottom w:type="dxa" w:w="80"/>
+              <w:right w:type="dxa" w:w="120"/>
+            </w:tcMar>
+          </w:tcPr>
+          <w:p>
+            <w:r>
+              <w:rPr>
+                <w:color w:val="1A1F2E"/>
+                <w:sz w:val="20"/>
+                <w:szCs w:val="20"/>
+              </w:rPr>
+              <w:t xml:space="preserve">Live</w:t>
+            </w:r>
+          </w:p>
+        </w:tc>
+      </w:tr>
+      <w:tr>
+        <w:tc>
+          <w:tcPr>
+            <w:tcW w:type="dxa" w:w="3120"/>
+            <w:tcBorders>
+              <w:top w:val="single" w:color="E5E7EB" w:sz="4"/>
+              <w:left w:val="single" w:color="E5E7EB" w:sz="4"/>
+              <w:bottom w:val="single" w:color="E5E7EB" w:sz="4"/>
+              <w:right w:val="single" w:color="E5E7EB" w:sz="4"/>
+            </w:tcBorders>
+            <w:tcMar>
+              <w:top w:type="dxa" w:w="80"/>
+              <w:left w:type="dxa" w:w="120"/>
+              <w:bottom w:type="dxa" w:w="80"/>
+              <w:right w:type="dxa" w:w="120"/>
+            </w:tcMar>
+          </w:tcPr>
+          <w:p>
+            <w:r>
+              <w:rPr>
+                <w:color w:val="1A1F2E"/>
+                <w:sz w:val="20"/>
+                <w:szCs w:val="20"/>
+              </w:rPr>
+              <w:t xml:space="preserve">Offline POS</w:t>
+            </w:r>
+          </w:p>
+        </w:tc>
+        <w:tc>
+          <w:tcPr>
+            <w:tcW w:type="dxa" w:w="3120"/>
+            <w:tcBorders>
+              <w:top w:val="single" w:color="E5E7EB" w:sz="4"/>
+              <w:left w:val="single" w:color="E5E7EB" w:sz="4"/>
+              <w:bottom w:val="single" w:color="E5E7EB" w:sz="4"/>
+              <w:right w:val="single" w:color="E5E7EB" w:sz="4"/>
+            </w:tcBorders>
+            <w:tcMar>
+              <w:top w:type="dxa" w:w="80"/>
+              <w:left w:type="dxa" w:w="120"/>
+              <w:bottom w:type="dxa" w:w="80"/>
+              <w:right w:type="dxa" w:w="120"/>
+            </w:tcMar>
+          </w:tcPr>
+          <w:p>
+            <w:r>
+              <w:rPr>
+                <w:color w:val="1A1F2E"/>
+                <w:sz w:val="20"/>
+                <w:szCs w:val="20"/>
+              </w:rPr>
+              <w:t xml:space="preserve">Order saat internet mati → IndexedDB queue → sync idempoten</w:t>
+            </w:r>
+          </w:p>
+        </w:tc>
+        <w:tc>
+          <w:tcPr>
+            <w:tcW w:type="dxa" w:w="3120"/>
+            <w:tcBorders>
+              <w:top w:val="single" w:color="E5E7EB" w:sz="4"/>
+              <w:left w:val="single" w:color="E5E7EB" w:sz="4"/>
+              <w:bottom w:val="single" w:color="E5E7EB" w:sz="4"/>
+              <w:right w:val="single" w:color="E5E7EB" w:sz="4"/>
+            </w:tcBorders>
+            <w:tcMar>
+              <w:top w:type="dxa" w:w="80"/>
+              <w:left w:type="dxa" w:w="120"/>
+              <w:bottom w:type="dxa" w:w="80"/>
+              <w:right w:type="dxa" w:w="120"/>
+            </w:tcMar>
+          </w:tcPr>
+          <w:p>
+            <w:r>
+              <w:rPr>
+                <w:color w:val="1A1F2E"/>
+                <w:sz w:val="20"/>
+                <w:szCs w:val="20"/>
+              </w:rPr>
+              <w:t xml:space="preserve">Live</w:t>
+            </w:r>
+          </w:p>
+        </w:tc>
+      </w:tr>
+      <w:tr>
+        <w:tc>
+          <w:tcPr>
+            <w:tcW w:type="dxa" w:w="3120"/>
+            <w:tcBorders>
+              <w:top w:val="single" w:color="E5E7EB" w:sz="4"/>
+              <w:left w:val="single" w:color="E5E7EB" w:sz="4"/>
+              <w:bottom w:val="single" w:color="E5E7EB" w:sz="4"/>
+              <w:right w:val="single" w:color="E5E7EB" w:sz="4"/>
+            </w:tcBorders>
+            <w:tcMar>
+              <w:top w:type="dxa" w:w="80"/>
+              <w:left w:type="dxa" w:w="120"/>
+              <w:bottom w:type="dxa" w:w="80"/>
+              <w:right w:type="dxa" w:w="120"/>
+            </w:tcMar>
+          </w:tcPr>
+          <w:p>
+            <w:r>
+              <w:rPr>
+                <w:color w:val="1A1F2E"/>
+                <w:sz w:val="20"/>
+                <w:szCs w:val="20"/>
+              </w:rPr>
+              <w:t xml:space="preserve">Checklist Wajib-Foto</w:t>
+            </w:r>
+          </w:p>
+        </w:tc>
+        <w:tc>
+          <w:tcPr>
+            <w:tcW w:type="dxa" w:w="3120"/>
+            <w:tcBorders>
+              <w:top w:val="single" w:color="E5E7EB" w:sz="4"/>
+              <w:left w:val="single" w:color="E5E7EB" w:sz="4"/>
+              <w:bottom w:val="single" w:color="E5E7EB" w:sz="4"/>
+              <w:right w:val="single" w:color="E5E7EB" w:sz="4"/>
+            </w:tcBorders>
+            <w:tcMar>
+              <w:top w:type="dxa" w:w="80"/>
+              <w:left w:type="dxa" w:w="120"/>
+              <w:bottom w:type="dxa" w:w="80"/>
+              <w:right w:type="dxa" w:w="120"/>
+            </w:tcMar>
+          </w:tcPr>
+          <w:p>
+            <w:r>
+              <w:rPr>
+                <w:color w:val="1A1F2E"/>
+                <w:sz w:val="20"/>
+                <w:szCs w:val="20"/>
+              </w:rPr>
+              <w:t xml:space="preserve">Item wajib lampirkan foto, blok simpan kalau kosong</w:t>
+            </w:r>
+          </w:p>
+        </w:tc>
+        <w:tc>
+          <w:tcPr>
+            <w:tcW w:type="dxa" w:w="3120"/>
+            <w:tcBorders>
+              <w:top w:val="single" w:color="E5E7EB" w:sz="4"/>
+              <w:left w:val="single" w:color="E5E7EB" w:sz="4"/>
+              <w:bottom w:val="single" w:color="E5E7EB" w:sz="4"/>
+              <w:right w:val="single" w:color="E5E7EB" w:sz="4"/>
+            </w:tcBorders>
+            <w:tcMar>
+              <w:top w:type="dxa" w:w="80"/>
+              <w:left w:type="dxa" w:w="120"/>
+              <w:bottom w:type="dxa" w:w="80"/>
+              <w:right w:type="dxa" w:w="120"/>
+            </w:tcMar>
+          </w:tcPr>
+          <w:p>
+            <w:r>
+              <w:rPr>
+                <w:color w:val="1A1F2E"/>
+                <w:sz w:val="20"/>
+                <w:szCs w:val="20"/>
+              </w:rPr>
+              <w:t xml:space="preserve">Live</w:t>
+            </w:r>
+          </w:p>
+        </w:tc>
+      </w:tr>
+      <w:tr>
+        <w:tc>
+          <w:tcPr>
+            <w:tcW w:type="dxa" w:w="3120"/>
+            <w:tcBorders>
+              <w:top w:val="single" w:color="E5E7EB" w:sz="4"/>
+              <w:left w:val="single" w:color="E5E7EB" w:sz="4"/>
+              <w:bottom w:val="single" w:color="E5E7EB" w:sz="4"/>
+              <w:right w:val="single" w:color="E5E7EB" w:sz="4"/>
+            </w:tcBorders>
+            <w:tcMar>
+              <w:top w:type="dxa" w:w="80"/>
+              <w:left w:type="dxa" w:w="120"/>
+              <w:bottom w:type="dxa" w:w="80"/>
+              <w:right w:type="dxa" w:w="120"/>
+            </w:tcMar>
+          </w:tcPr>
+          <w:p>
+            <w:r>
+              <w:rPr>
+                <w:color w:val="1A1F2E"/>
+                <w:sz w:val="20"/>
+                <w:szCs w:val="20"/>
+              </w:rPr>
+              <w:t xml:space="preserve">Absensi Hardening</w:t>
+            </w:r>
+          </w:p>
+        </w:tc>
+        <w:tc>
+          <w:tcPr>
+            <w:tcW w:type="dxa" w:w="3120"/>
+            <w:tcBorders>
+              <w:top w:val="single" w:color="E5E7EB" w:sz="4"/>
+              <w:left w:val="single" w:color="E5E7EB" w:sz="4"/>
+              <w:bottom w:val="single" w:color="E5E7EB" w:sz="4"/>
+              <w:right w:val="single" w:color="E5E7EB" w:sz="4"/>
+            </w:tcBorders>
+            <w:tcMar>
+              <w:top w:type="dxa" w:w="80"/>
+              <w:left w:type="dxa" w:w="120"/>
+              <w:bottom w:type="dxa" w:w="80"/>
+              <w:right w:type="dxa" w:w="120"/>
+            </w:tcMar>
+          </w:tcPr>
+          <w:p>
+            <w:r>
+              <w:rPr>
+                <w:color w:val="1A1F2E"/>
+                <w:sz w:val="20"/>
+                <w:szCs w:val="20"/>
+              </w:rPr>
+              <w:t xml:space="preserve">Selfie + geofence + jadwal shift (telat/lembur)</w:t>
+            </w:r>
+          </w:p>
+        </w:tc>
+        <w:tc>
+          <w:tcPr>
+            <w:tcW w:type="dxa" w:w="3120"/>
+            <w:tcBorders>
+              <w:top w:val="single" w:color="E5E7EB" w:sz="4"/>
+              <w:left w:val="single" w:color="E5E7EB" w:sz="4"/>
+              <w:bottom w:val="single" w:color="E5E7EB" w:sz="4"/>
+              <w:right w:val="single" w:color="E5E7EB" w:sz="4"/>
+            </w:tcBorders>
+            <w:tcMar>
+              <w:top w:type="dxa" w:w="80"/>
+              <w:left w:type="dxa" w:w="120"/>
+              <w:bottom w:type="dxa" w:w="80"/>
+              <w:right w:type="dxa" w:w="120"/>
+            </w:tcMar>
+          </w:tcPr>
+          <w:p>
+            <w:r>
+              <w:rPr>
+                <w:color w:val="1A1F2E"/>
+                <w:sz w:val="20"/>
+                <w:szCs w:val="20"/>
+              </w:rPr>
+              <w:t xml:space="preserve">Live</w:t>
+            </w:r>
+          </w:p>
+        </w:tc>
+      </w:tr>
+      <w:tr>
+        <w:tc>
+          <w:tcPr>
+            <w:tcW w:type="dxa" w:w="3120"/>
+            <w:tcBorders>
+              <w:top w:val="single" w:color="E5E7EB" w:sz="4"/>
+              <w:left w:val="single" w:color="E5E7EB" w:sz="4"/>
+              <w:bottom w:val="single" w:color="E5E7EB" w:sz="4"/>
+              <w:right w:val="single" w:color="E5E7EB" w:sz="4"/>
+            </w:tcBorders>
+            <w:tcMar>
+              <w:top w:type="dxa" w:w="80"/>
+              <w:left w:type="dxa" w:w="120"/>
+              <w:bottom w:type="dxa" w:w="80"/>
+              <w:right w:type="dxa" w:w="120"/>
+            </w:tcMar>
+          </w:tcPr>
+          <w:p>
+            <w:r>
+              <w:rPr>
+                <w:color w:val="1A1F2E"/>
+                <w:sz w:val="20"/>
+                <w:szCs w:val="20"/>
+              </w:rPr>
+              <w:t xml:space="preserve">Bonus &amp; Bagi-Hasil</w:t>
+            </w:r>
+          </w:p>
+        </w:tc>
+        <w:tc>
+          <w:tcPr>
+            <w:tcW w:type="dxa" w:w="3120"/>
+            <w:tcBorders>
+              <w:top w:val="single" w:color="E5E7EB" w:sz="4"/>
+              <w:left w:val="single" w:color="E5E7EB" w:sz="4"/>
+              <w:bottom w:val="single" w:color="E5E7EB" w:sz="4"/>
+              <w:right w:val="single" w:color="E5E7EB" w:sz="4"/>
+            </w:tcBorders>
+            <w:tcMar>
+              <w:top w:type="dxa" w:w="80"/>
+              <w:left w:type="dxa" w:w="120"/>
+              <w:bottom w:type="dxa" w:w="80"/>
+              <w:right w:type="dxa" w:w="120"/>
+            </w:tcMar>
+          </w:tcPr>
+          <w:p>
+            <w:r>
+              <w:rPr>
+                <w:color w:val="1A1F2E"/>
+                <w:sz w:val="20"/>
+                <w:szCs w:val="20"/>
+              </w:rPr>
+              <w:t xml:space="preserve">Aturan bonus + profit-sharing ke slip gaji</w:t>
+            </w:r>
+          </w:p>
+        </w:tc>
+        <w:tc>
+          <w:tcPr>
+            <w:tcW w:type="dxa" w:w="3120"/>
+            <w:tcBorders>
+              <w:top w:val="single" w:color="E5E7EB" w:sz="4"/>
+              <w:left w:val="single" w:color="E5E7EB" w:sz="4"/>
+              <w:bottom w:val="single" w:color="E5E7EB" w:sz="4"/>
+              <w:right w:val="single" w:color="E5E7EB" w:sz="4"/>
+            </w:tcBorders>
+            <w:tcMar>
+              <w:top w:type="dxa" w:w="80"/>
+              <w:left w:type="dxa" w:w="120"/>
+              <w:bottom w:type="dxa" w:w="80"/>
+              <w:right w:type="dxa" w:w="120"/>
+            </w:tcMar>
+          </w:tcPr>
+          <w:p>
+            <w:r>
+              <w:rPr>
+                <w:color w:val="1A1F2E"/>
+                <w:sz w:val="20"/>
+                <w:szCs w:val="20"/>
+              </w:rPr>
+              <w:t xml:space="preserve">Live</w:t>
+            </w:r>
+          </w:p>
+        </w:tc>
+      </w:tr>
+    </w:tbl>
+    <w:p>
+      <w:pPr>
+        <w:pBdr>
+          <w:left w:val="single" w:color="F59E0B" w:sz="24" w:space="8"/>
+        </w:pBdr>
+        <w:shd w:fill="FEF3C7" w:val="clear"/>
+        <w:spacing w:after="120" w:before="120"/>
+      </w:pPr>
+      <w:r>
+        <w:rPr>
+          <w:i/>
+          <w:iCs/>
+          <w:color w:val="1A1F2E"/>
+        </w:rPr>
+        <w:t xml:space="preserve">E2E manual di device masih pending untuk: offline POS (airplane mode), voice order, checklist wajib-foto, referral.</w:t>
+      </w:r>
+    </w:p>
     <w:p>
       <w:pPr>
         <w:spacing w:before="600"/>

</xml_diff>

<commit_message>
docs: fix konsistensi — AI features 9→11, nama tabel real (hl_transaksi/tenants/hl_users), 103→125 tabel, 'M'→'Miliar', tanggal update; regen docx+pdf
</commit_message>
<xml_diff>
--- a/docs/exports/LAMASY-Internal-Document.docx
+++ b/docs/exports/LAMASY-Internal-Document.docx
@@ -97,7 +97,7 @@
           <w:sz w:val="20"/>
           <w:szCs w:val="20"/>
         </w:rPr>
-        <w:t xml:space="preserve">Tanggal: 24 Juni 2026</w:t>
+        <w:t xml:space="preserve">Tanggal: 24 Juni 2026 (diperbarui 30 Juni 2026)</w:t>
       </w:r>
     </w:p>
     <w:p>
@@ -1401,7 +1401,7 @@
         </w:numPr>
       </w:pPr>
       <w:r>
-        <w:t xml:space="preserve">DB INSERT saas_tenants + hl_outlets + saas_users; auto-credit 10.000 coin trial</w:t>
+        <w:t xml:space="preserve">DB INSERT tenants + hl_outlets + hl_users; auto-credit 10.000 coin trial</w:t>
       </w:r>
     </w:p>
     <w:p>
@@ -1583,7 +1583,7 @@
         </w:numPr>
       </w:pPr>
       <w:r>
-        <w:t xml:space="preserve">DB INSERT hl_order + hl_order_item + hl_pembayaran; status = 'diterima'</w:t>
+        <w:t xml:space="preserve">DB INSERT hl_transaksi + hl_transaksi_item (pembayaran inline kolom status_bayar/dp); status = 'diterima'</w:t>
       </w:r>
     </w:p>
     <w:p>
@@ -2372,7 +2372,7 @@
         </w:numPr>
       </w:pPr>
       <w:r>
-        <w:t xml:space="preserve">Confirm → batch INSERT hl_pelanggan, hl_order, hl_order_item</w:t>
+        <w:t xml:space="preserve">Confirm → batch INSERT hl_pelanggan, hl_transaksi, hl_transaksi_item</w:t>
       </w:r>
     </w:p>
     <w:p>
@@ -8313,7 +8313,7 @@
         <w:spacing w:after="120" w:before="320"/>
       </w:pPr>
       <w:r>
-        <w:t xml:space="preserve">7.1 9 Fitur AI yang Live</w:t>
+        <w:t xml:space="preserve">7.1 Fitur AI Inti yang Live</w:t>
       </w:r>
     </w:p>
     <w:tbl>
@@ -9616,7 +9616,7 @@
     </w:p>
     <w:p>
       <w:r>
-        <w:t xml:space="preserve">103 tabel total, dikelompokkan berdasarkan domain.</w:t>
+        <w:t xml:space="preserve">~125 tabel total, dikelompokkan berdasarkan domain.</w:t>
       </w:r>
     </w:p>
     <w:p>
@@ -9637,7 +9637,7 @@
         </w:numPr>
       </w:pPr>
       <w:r>
-        <w:t xml:space="preserve">saas_tenants — tenant master + coin balance</w:t>
+        <w:t xml:space="preserve">tenants — tenant master + coin balance</w:t>
       </w:r>
     </w:p>
     <w:p>
@@ -9649,7 +9649,7 @@
         </w:numPr>
       </w:pPr>
       <w:r>
-        <w:t xml:space="preserve">saas_users — user accounts per tenant</w:t>
+        <w:t xml:space="preserve">hl_users — user accounts per tenant</w:t>
       </w:r>
     </w:p>
     <w:p>
@@ -9825,7 +9825,7 @@
         </w:numPr>
       </w:pPr>
       <w:r>
-        <w:t xml:space="preserve">hl_order, hl_order_item, hl_order_notes</w:t>
+        <w:t xml:space="preserve">hl_transaksi, hl_transaksi_item, hl_order_notes</w:t>
       </w:r>
     </w:p>
     <w:p>
@@ -9837,7 +9837,7 @@
         </w:numPr>
       </w:pPr>
       <w:r>
-        <w:t xml:space="preserve">hl_pembayaran</w:t>
+        <w:t xml:space="preserve">Pembayaran: kolom status_bayar/dp/sisa_bayar di hl_transaksi</w:t>
       </w:r>
     </w:p>
     <w:p>
@@ -13684,7 +13684,7 @@
                 <w:sz w:val="20"/>
                 <w:szCs w:val="20"/>
               </w:rPr>
-              <w:t xml:space="preserve">9</w:t>
+              <w:t xml:space="preserve">11</w:t>
             </w:r>
           </w:p>
         </w:tc>

</xml_diff>

<commit_message>
docs: koreksi akurasi teknis — outlets (bukan hl_outlets), CSRF random_bytes (bukan HMAC), WA via wa.me (bukan Fonnte API), stage produksi real, saas_packages, superadmin_logs
</commit_message>
<xml_diff>
--- a/docs/exports/LAMASY-Internal-Document.docx
+++ b/docs/exports/LAMASY-Internal-Document.docx
@@ -701,34 +701,34 @@
                 <w:sz w:val="20"/>
                 <w:szCs w:val="20"/>
               </w:rPr>
-              <w:t xml:space="preserve">Session + HMAC-SHA256 + CSRF</w:t>
-            </w:r>
-          </w:p>
-        </w:tc>
-        <w:tc>
-          <w:tcPr>
-            <w:tcW w:type="dxa" w:w="3120"/>
-            <w:tcBorders>
-              <w:top w:val="single" w:color="E5E7EB" w:sz="4"/>
-              <w:left w:val="single" w:color="E5E7EB" w:sz="4"/>
-              <w:bottom w:val="single" w:color="E5E7EB" w:sz="4"/>
-              <w:right w:val="single" w:color="E5E7EB" w:sz="4"/>
-            </w:tcBorders>
-            <w:tcMar>
-              <w:top w:type="dxa" w:w="80"/>
-              <w:left w:type="dxa" w:w="120"/>
-              <w:bottom w:type="dxa" w:w="80"/>
-              <w:right w:type="dxa" w:w="120"/>
-            </w:tcMar>
-          </w:tcPr>
-          <w:p>
-            <w:r>
-              <w:rPr>
-                <w:color w:val="1A1F2E"/>
-                <w:sz w:val="20"/>
-                <w:szCs w:val="20"/>
-              </w:rPr>
-              <w:t xml:space="preserve">Per-request token</w:t>
+              <w:t xml:space="preserve">Session + CSRF (random per-sesi)</w:t>
+            </w:r>
+          </w:p>
+        </w:tc>
+        <w:tc>
+          <w:tcPr>
+            <w:tcW w:type="dxa" w:w="3120"/>
+            <w:tcBorders>
+              <w:top w:val="single" w:color="E5E7EB" w:sz="4"/>
+              <w:left w:val="single" w:color="E5E7EB" w:sz="4"/>
+              <w:bottom w:val="single" w:color="E5E7EB" w:sz="4"/>
+              <w:right w:val="single" w:color="E5E7EB" w:sz="4"/>
+            </w:tcBorders>
+            <w:tcMar>
+              <w:top w:type="dxa" w:w="80"/>
+              <w:left w:type="dxa" w:w="120"/>
+              <w:bottom w:type="dxa" w:w="80"/>
+              <w:right w:type="dxa" w:w="120"/>
+            </w:tcMar>
+          </w:tcPr>
+          <w:p>
+            <w:r>
+              <w:rPr>
+                <w:color w:val="1A1F2E"/>
+                <w:sz w:val="20"/>
+                <w:szCs w:val="20"/>
+              </w:rPr>
+              <w:t xml:space="preserve">HMAC-SHA256 utk token switch-outlet</w:t>
             </w:r>
           </w:p>
         </w:tc>
@@ -950,34 +950,34 @@
                 <w:sz w:val="20"/>
                 <w:szCs w:val="20"/>
               </w:rPr>
-              <w:t xml:space="preserve">Fonnte API</w:t>
-            </w:r>
-          </w:p>
-        </w:tc>
-        <w:tc>
-          <w:tcPr>
-            <w:tcW w:type="dxa" w:w="3120"/>
-            <w:tcBorders>
-              <w:top w:val="single" w:color="E5E7EB" w:sz="4"/>
-              <w:left w:val="single" w:color="E5E7EB" w:sz="4"/>
-              <w:bottom w:val="single" w:color="E5E7EB" w:sz="4"/>
-              <w:right w:val="single" w:color="E5E7EB" w:sz="4"/>
-            </w:tcBorders>
-            <w:tcMar>
-              <w:top w:type="dxa" w:w="80"/>
-              <w:left w:type="dxa" w:w="120"/>
-              <w:bottom w:type="dxa" w:w="80"/>
-              <w:right w:type="dxa" w:w="120"/>
-            </w:tcMar>
-          </w:tcPr>
-          <w:p>
-            <w:r>
-              <w:rPr>
-                <w:color w:val="1A1F2E"/>
-                <w:sz w:val="20"/>
-                <w:szCs w:val="20"/>
-              </w:rPr>
-              <w:t xml:space="preserve">1000 msg/bulan free tier</w:t>
+              <w:t xml:space="preserve">wa.me click-to-chat link</w:t>
+            </w:r>
+          </w:p>
+        </w:tc>
+        <w:tc>
+          <w:tcPr>
+            <w:tcW w:type="dxa" w:w="3120"/>
+            <w:tcBorders>
+              <w:top w:val="single" w:color="E5E7EB" w:sz="4"/>
+              <w:left w:val="single" w:color="E5E7EB" w:sz="4"/>
+              <w:bottom w:val="single" w:color="E5E7EB" w:sz="4"/>
+              <w:right w:val="single" w:color="E5E7EB" w:sz="4"/>
+            </w:tcBorders>
+            <w:tcMar>
+              <w:top w:type="dxa" w:w="80"/>
+              <w:left w:type="dxa" w:w="120"/>
+              <w:bottom w:type="dxa" w:w="80"/>
+              <w:right w:type="dxa" w:w="120"/>
+            </w:tcMar>
+          </w:tcPr>
+          <w:p>
+            <w:r>
+              <w:rPr>
+                <w:color w:val="1A1F2E"/>
+                <w:sz w:val="20"/>
+                <w:szCs w:val="20"/>
+              </w:rPr>
+              <w:t xml:space="preserve">Semi-manual (staf klik kirim), bukan API blast</w:t>
             </w:r>
           </w:p>
         </w:tc>
@@ -1401,7 +1401,7 @@
         </w:numPr>
       </w:pPr>
       <w:r>
-        <w:t xml:space="preserve">DB INSERT tenants + hl_outlets + hl_users; auto-credit 10.000 coin trial</w:t>
+        <w:t xml:space="preserve">DB INSERT tenants + outlets + hl_users; auto-credit 10.000 coin trial</w:t>
       </w:r>
     </w:p>
     <w:p>
@@ -1619,7 +1619,7 @@
         </w:numPr>
       </w:pPr>
       <w:r>
-        <w:t xml:space="preserve">Staff produksi scan QR di /produksi.php → 6 tahap dengan signature + foto</w:t>
+        <w:t xml:space="preserve">Staff produksi scan QR di /produksi.php → input tiap tahap + signature + foto</w:t>
       </w:r>
     </w:p>
     <w:p>
@@ -1631,7 +1631,7 @@
         </w:numPr>
       </w:pPr>
       <w:r>
-        <w:t xml:space="preserve">Tahap: Terima → Sortir → Cuci → Setrika → Packing → Selesai</w:t>
+        <w:t xml:space="preserve">Tahap (status_proses): Masuk → Cuci → Kering → Setrika → Siap</w:t>
       </w:r>
     </w:p>
     <w:p>
@@ -1643,7 +1643,7 @@
         </w:numPr>
       </w:pPr>
       <w:r>
-        <w:t xml:space="preserve">Status order auto-update: diterima → diproses → siap</w:t>
+        <w:t xml:space="preserve">Status proses auto-update: masuk → cuci → kering → setrika → siap</w:t>
       </w:r>
     </w:p>
     <w:p>
@@ -9697,7 +9697,7 @@
         </w:numPr>
       </w:pPr>
       <w:r>
-        <w:t xml:space="preserve">saas_packages, saas_pricing — subscription tiers</w:t>
+        <w:t xml:space="preserve">saas_packages — subscription tiers</w:t>
       </w:r>
     </w:p>
     <w:p>
@@ -9756,7 +9756,7 @@
         </w:numPr>
       </w:pPr>
       <w:r>
-        <w:t xml:space="preserve">hl_outlets, hl_layanan, hl_layanan_master, hl_parfum</w:t>
+        <w:t xml:space="preserve">outlets, hl_layanan, hl_layanan_master, hl_parfum</w:t>
       </w:r>
     </w:p>
     <w:p>
@@ -10262,7 +10262,7 @@
         </w:numPr>
       </w:pPr>
       <w:r>
-        <w:t xml:space="preserve">CSRF token per request (HMAC-SHA256 signed)</w:t>
+        <w:t xml:space="preserve">CSRF token per sesi (random_bytes(32)), dicek verifyCsrf()</w:t>
       </w:r>
     </w:p>
     <w:p>
@@ -10461,7 +10461,7 @@
         </w:numPr>
       </w:pPr>
       <w:r>
-        <w:t xml:space="preserve">super_admin_audit — SA-level action log</w:t>
+        <w:t xml:space="preserve">superadmin_logs — SA-level action log</w:t>
       </w:r>
     </w:p>
     <w:p>
@@ -10800,7 +10800,7 @@
                 <w:sz w:val="20"/>
                 <w:szCs w:val="20"/>
               </w:rPr>
-              <w:t xml:space="preserve">Fonnte API</w:t>
+              <w:t xml:space="preserve">wa.me link (click-to-chat)</w:t>
             </w:r>
           </w:p>
         </w:tc>
@@ -10827,7 +10827,7 @@
                 <w:sz w:val="20"/>
                 <w:szCs w:val="20"/>
               </w:rPr>
-              <w:t xml:space="preserve">Order siap, kurir assignment, broadcast, low coin</w:t>
+              <w:t xml:space="preserve">Order siap, tagih piutang, dll — staf klik kirim</w:t>
             </w:r>
           </w:p>
         </w:tc>
@@ -10854,7 +10854,7 @@
                 <w:sz w:val="20"/>
                 <w:szCs w:val="20"/>
               </w:rPr>
-              <w:t xml:space="preserve">1000 msg/bulan free</w:t>
+              <w:t xml:space="preserve">—</w:t>
             </w:r>
           </w:p>
         </w:tc>
@@ -11202,7 +11202,7 @@
         </w:numPr>
       </w:pPr>
       <w:r>
-        <w:t xml:space="preserve">Fonnte API key + Anthropic API key di env config</w:t>
+        <w:t xml:space="preserve">Anthropic API key di env config (WA via wa.me link, tanpa API key)</w:t>
       </w:r>
     </w:p>
     <w:p>

</xml_diff>